<commit_message>
Fix email plan wording in v2 contract
Corrected inaccurate claim that Supabase handles broadcast emails.
The broadcast system uses Resend, not Supabase (Supabase email is
auth-only). Updated all four affected spots:

- Context box: clarifies Resend is the broadcast service; Supabase
  email only handles signups/resets; free tier = 100/day cap
- Option A label: "Resend free tier — 100 emails/day (8 days for 800)"
- Comparison table: 500 → 100/day with 8-day warning; "not suitable
  for full enrollment broadcasts"
- Selected option summary: accurate 100/day cap language

Co-Authored-By: Claude Sonnet 4.6 <noreply@anthropic.com>
</commit_message>
<xml_diff>
--- a/docs/PharmaTrack_Partnership_Proposal_v2.docx
+++ b/docs/PharmaTrack_Partnership_Proposal_v2.docx
@@ -1999,7 +1999,7 @@
                 <w:color w:val="1E40AF"/>
                 <w:sz w:val="18"/>
               </w:rPr>
-              <w:t>Supabase (our database provider) includes a built-in email service on the free tier, but it is capped at 500 emails per event notification cycle. With an enrollment of approximately 800 students, the free tier would leave ~300 students unreached per broadcast. The Resend Pro Plan removes this cap entirely.</w:t>
+              <w:t>PharmaTrack's broadcast email system runs on Resend — not Supabase. Supabase's built-in email only handles auth flows (signup confirmations, password resets) and is not used for event notifications. Without Resend Pro, broadcasts are capped at 100 emails per day (Resend free tier), meaning a full 800-student notification would take 8 days to complete. Resend Pro removes this cap, enabling all 800 students to be reached in a single broadcast within seconds.</w:t>
             </w:r>
           </w:p>
         </w:tc>
@@ -2061,7 +2061,7 @@
                 <w:color w:val="666688"/>
                 <w:sz w:val="18"/>
               </w:rPr>
-              <w:t>All features, Supabase free-tier email (up to 500 students per broadcast)</w:t>
+              <w:t>All features, Resend free tier — 100 emails/day limit (full 800-student broadcast takes 8 days)</w:t>
             </w:r>
           </w:p>
           <w:p>
@@ -2378,7 +2378,7 @@
                 <w:i w:val="0"/>
                 <w:sz w:val="18"/>
               </w:rPr>
-              <w:t>Supabase free tier</w:t>
+              <w:t>Resend free tier</w:t>
             </w:r>
           </w:p>
         </w:tc>
@@ -2438,9 +2438,10 @@
               <w:rPr>
                 <w:b w:val="0"/>
                 <w:i w:val="0"/>
+                <w:color w:val="F97316"/>
                 <w:sz w:val="18"/>
               </w:rPr>
-              <w:t>Up to 500</w:t>
+              <w:t>100/day — full 800-student broadcast takes 8 days</w:t>
             </w:r>
           </w:p>
         </w:tc>
@@ -2461,7 +2462,7 @@
                 <w:color w:val="10B981"/>
                 <w:sz w:val="18"/>
               </w:rPr>
-              <w:t>Up to 800 (full enrollment)</w:t>
+              <w:t>All 800 students in one broadcast (seconds)</w:t>
             </w:r>
           </w:p>
         </w:tc>
@@ -2503,7 +2504,7 @@
                 <w:i w:val="0"/>
                 <w:sz w:val="18"/>
               </w:rPr>
-              <w:t>Not applicable</w:t>
+              <w:t>Free (100 emails/day cap)</w:t>
             </w:r>
           </w:p>
         </w:tc>
@@ -2565,7 +2566,7 @@
                 <w:i w:val="0"/>
                 <w:sz w:val="18"/>
               </w:rPr>
-              <w:t>N/A</w:t>
+              <w:t>Dept. (free account)</w:t>
             </w:r>
           </w:p>
         </w:tc>
@@ -2627,7 +2628,7 @@
                 <w:i w:val="0"/>
                 <w:sz w:val="18"/>
               </w:rPr>
-              <w:t>~2,500 / month</w:t>
+              <w:t>~3,000 / month max</w:t>
             </w:r>
           </w:p>
         </w:tc>
@@ -2687,9 +2688,10 @@
               <w:rPr>
                 <w:b w:val="0"/>
                 <w:i w:val="0"/>
+                <w:color w:val="F97316"/>
                 <w:sz w:val="18"/>
               </w:rPr>
-              <w:t>Smaller events / testing</w:t>
+              <w:t>Not suitable for full enrollment broadcasts</w:t>
             </w:r>
           </w:p>
         </w:tc>
@@ -4337,7 +4339,7 @@
                 <w:color w:val="444466"/>
                 <w:sz w:val="18"/>
               </w:rPr>
-              <w:t>All features. Supabase free-tier email (up to 500 students per broadcast). No additional monthly software cost.</w:t>
+              <w:t>All features. Resend free tier — 100 emails/day cap. Full 800-student broadcast takes 8 days. No additional monthly software cost.</w:t>
             </w:r>
           </w:p>
         </w:tc>

</xml_diff>